<commit_message>
added optional steps to edit plots
</commit_message>
<xml_diff>
--- a/JCF_pipeline_steps.docx
+++ b/JCF_pipeline_steps.docx
@@ -41,11 +41,19 @@
       <w:r>
         <w:t xml:space="preserve">Run everything from the </w:t>
       </w:r>
-      <w:r>
-        <w:rPr>
-          <w:rStyle w:val="VerbatimChar"/>
-        </w:rPr>
-        <w:t>forecasting_odemodels code/</w:t>
+      <w:proofErr w:type="spellStart"/>
+      <w:r>
+        <w:rPr>
+          <w:rStyle w:val="VerbatimChar"/>
+        </w:rPr>
+        <w:t>forecasting_odemodels</w:t>
+      </w:r>
+      <w:proofErr w:type="spellEnd"/>
+      <w:r>
+        <w:rPr>
+          <w:rStyle w:val="VerbatimChar"/>
+        </w:rPr>
+        <w:t xml:space="preserve"> code/</w:t>
       </w:r>
       <w:r>
         <w:t xml:space="preserve"> folder, with that folder on the MATLAB path. </w:t>
@@ -87,7 +95,15 @@
         <w:t>-</w:t>
       </w:r>
       <w:r>
-        <w:t xml:space="preserve"> Practice run (Ebola scenario 1)</w:t>
+        <w:t xml:space="preserve"> Practice </w:t>
+      </w:r>
+      <w:proofErr w:type="gramStart"/>
+      <w:r>
+        <w:t>run</w:t>
+      </w:r>
+      <w:proofErr w:type="gramEnd"/>
+      <w:r>
+        <w:t xml:space="preserve"> (Ebola scenario 1)</w:t>
       </w:r>
     </w:p>
     <w:p>
@@ -95,7 +111,15 @@
         <w:pStyle w:val="FirstParagraph"/>
       </w:pPr>
       <w:r>
-        <w:t xml:space="preserve">Nothing needs editing. All configuration is already set to </w:t>
+        <w:t xml:space="preserve">Nothing needs editing. All </w:t>
+      </w:r>
+      <w:proofErr w:type="gramStart"/>
+      <w:r>
+        <w:t>configuration is</w:t>
+      </w:r>
+      <w:proofErr w:type="gramEnd"/>
+      <w:r>
+        <w:t xml:space="preserve"> already set to </w:t>
       </w:r>
       <m:oMath>
         <m:r>
@@ -254,17 +278,33 @@
       <w:pPr>
         <w:pStyle w:val="SourceCode"/>
       </w:pPr>
+      <w:proofErr w:type="spellStart"/>
       <w:r>
         <w:rPr>
           <w:rStyle w:val="VariableTok"/>
         </w:rPr>
-        <w:t>collect_metrics_simple</w:t>
-      </w:r>
+        <w:t>collect_metrics_</w:t>
+      </w:r>
+      <w:proofErr w:type="gramStart"/>
+      <w:r>
+        <w:rPr>
+          <w:rStyle w:val="VariableTok"/>
+        </w:rPr>
+        <w:t>simple</w:t>
+      </w:r>
+      <w:proofErr w:type="spellEnd"/>
       <w:r>
         <w:rPr>
           <w:rStyle w:val="NormalTok"/>
         </w:rPr>
-        <w:t>()</w:t>
+        <w:t>(</w:t>
+      </w:r>
+      <w:proofErr w:type="gramEnd"/>
+      <w:r>
+        <w:rPr>
+          <w:rStyle w:val="NormalTok"/>
+        </w:rPr>
+        <w:t>)</w:t>
       </w:r>
     </w:p>
     <w:p>
@@ -274,12 +314,14 @@
       <w:r>
         <w:t xml:space="preserve">Writes </w:t>
       </w:r>
+      <w:proofErr w:type="spellStart"/>
       <w:r>
         <w:rPr>
           <w:rStyle w:val="VerbatimChar"/>
         </w:rPr>
         <w:t>forecast_metrics_summary.mat</w:t>
       </w:r>
+      <w:proofErr w:type="spellEnd"/>
       <w:r>
         <w:t xml:space="preserve"> / </w:t>
       </w:r>
@@ -290,7 +332,15 @@
         <w:t>.csv</w:t>
       </w:r>
       <w:r>
-        <w:t xml:space="preserve"> — MAE, MSE, coverage, WIS and AICc for every model-window pair. </w:t>
+        <w:t xml:space="preserve"> — MAE, MSE, coverage, WIS and </w:t>
+      </w:r>
+      <w:proofErr w:type="spellStart"/>
+      <w:r>
+        <w:t>AICc</w:t>
+      </w:r>
+      <w:proofErr w:type="spellEnd"/>
+      <w:r>
+        <w:t xml:space="preserve"> for every model-window pair. </w:t>
       </w:r>
       <w:r>
         <w:rPr>
@@ -302,21 +352,25 @@
       <w:r>
         <w:t xml:space="preserve"> (</w:t>
       </w:r>
+      <w:proofErr w:type="spellStart"/>
       <w:r>
         <w:rPr>
           <w:rStyle w:val="VerbatimChar"/>
         </w:rPr>
         <w:t>WIS_calib</w:t>
       </w:r>
+      <w:proofErr w:type="spellEnd"/>
       <w:r>
         <w:t xml:space="preserve"> and </w:t>
       </w:r>
+      <w:proofErr w:type="spellStart"/>
       <w:r>
         <w:rPr>
           <w:rStyle w:val="VerbatimChar"/>
         </w:rPr>
         <w:t>WIS_forecast</w:t>
       </w:r>
+      <w:proofErr w:type="spellEnd"/>
       <w:r>
         <w:t>), so steps 1–2 never need repeating for JCF.</w:t>
       </w:r>
@@ -335,17 +389,33 @@
       <w:pPr>
         <w:pStyle w:val="SourceCode"/>
       </w:pPr>
+      <w:proofErr w:type="spellStart"/>
       <w:r>
         <w:rPr>
           <w:rStyle w:val="VariableTok"/>
         </w:rPr>
-        <w:t>create_ensemble_simple</w:t>
-      </w:r>
+        <w:t>create_ensemble_</w:t>
+      </w:r>
+      <w:proofErr w:type="gramStart"/>
+      <w:r>
+        <w:rPr>
+          <w:rStyle w:val="VariableTok"/>
+        </w:rPr>
+        <w:t>simple</w:t>
+      </w:r>
+      <w:proofErr w:type="spellEnd"/>
       <w:r>
         <w:rPr>
           <w:rStyle w:val="NormalTok"/>
         </w:rPr>
-        <w:t>()</w:t>
+        <w:t>(</w:t>
+      </w:r>
+      <w:proofErr w:type="gramEnd"/>
+      <w:r>
+        <w:rPr>
+          <w:rStyle w:val="NormalTok"/>
+        </w:rPr>
+        <w:t>)</w:t>
       </w:r>
     </w:p>
     <w:p>
@@ -406,12 +476,14 @@
       <w:r>
         <w:t xml:space="preserve">, pools with the linear pool. Writes </w:t>
       </w:r>
+      <w:proofErr w:type="spellStart"/>
       <w:r>
         <w:rPr>
           <w:rStyle w:val="VerbatimChar"/>
         </w:rPr>
         <w:t>ensemble_results.mat</w:t>
       </w:r>
+      <w:proofErr w:type="spellEnd"/>
       <w:r>
         <w:t xml:space="preserve"> / </w:t>
       </w:r>
@@ -428,7 +500,21 @@
         <w:rPr>
           <w:rStyle w:val="VerbatimChar"/>
         </w:rPr>
-        <w:t>output/Forecast-Ensemble-LinearPool-*.csv</w:t>
+        <w:t>output/Forecast-Ensemble-</w:t>
+      </w:r>
+      <w:proofErr w:type="spellStart"/>
+      <w:r>
+        <w:rPr>
+          <w:rStyle w:val="VerbatimChar"/>
+        </w:rPr>
+        <w:t>LinearPool</w:t>
+      </w:r>
+      <w:proofErr w:type="spellEnd"/>
+      <w:r>
+        <w:rPr>
+          <w:rStyle w:val="VerbatimChar"/>
+        </w:rPr>
+        <w:t>-*.csv</w:t>
       </w:r>
       <w:r>
         <w:t>.</w:t>
@@ -448,12 +534,14 @@
       <w:pPr>
         <w:pStyle w:val="SourceCode"/>
       </w:pPr>
+      <w:proofErr w:type="spellStart"/>
       <w:r>
         <w:rPr>
           <w:rStyle w:val="VariableTok"/>
         </w:rPr>
         <w:t>plot_model_fit_simple</w:t>
       </w:r>
+      <w:proofErr w:type="spellEnd"/>
       <w:r>
         <w:rPr>
           <w:rStyle w:val="NormalTok"/>
@@ -463,17 +551,33 @@
       <w:r>
         <w:br/>
       </w:r>
+      <w:proofErr w:type="spellStart"/>
       <w:r>
         <w:rPr>
           <w:rStyle w:val="VariableTok"/>
         </w:rPr>
-        <w:t>plot_forecasts_simple</w:t>
-      </w:r>
+        <w:t>plot_forecasts_</w:t>
+      </w:r>
+      <w:proofErr w:type="gramStart"/>
+      <w:r>
+        <w:rPr>
+          <w:rStyle w:val="VariableTok"/>
+        </w:rPr>
+        <w:t>simple</w:t>
+      </w:r>
+      <w:proofErr w:type="spellEnd"/>
       <w:r>
         <w:rPr>
           <w:rStyle w:val="NormalTok"/>
         </w:rPr>
-        <w:t>()</w:t>
+        <w:t>(</w:t>
+      </w:r>
+      <w:proofErr w:type="gramEnd"/>
+      <w:r>
+        <w:rPr>
+          <w:rStyle w:val="NormalTok"/>
+        </w:rPr>
+        <w:t>)</w:t>
       </w:r>
     </w:p>
     <w:p>
@@ -508,17 +612,33 @@
       <w:pPr>
         <w:pStyle w:val="SourceCode"/>
       </w:pPr>
+      <w:proofErr w:type="spellStart"/>
       <w:r>
         <w:rPr>
           <w:rStyle w:val="VariableTok"/>
         </w:rPr>
-        <w:t>run_jcf_sweep</w:t>
-      </w:r>
+        <w:t>run_jcf_</w:t>
+      </w:r>
+      <w:proofErr w:type="gramStart"/>
+      <w:r>
+        <w:rPr>
+          <w:rStyle w:val="VariableTok"/>
+        </w:rPr>
+        <w:t>sweep</w:t>
+      </w:r>
+      <w:proofErr w:type="spellEnd"/>
       <w:r>
         <w:rPr>
           <w:rStyle w:val="NormalTok"/>
         </w:rPr>
-        <w:t>()</w:t>
+        <w:t>(</w:t>
+      </w:r>
+      <w:proofErr w:type="gramEnd"/>
+      <w:r>
+        <w:rPr>
+          <w:rStyle w:val="NormalTok"/>
+        </w:rPr>
+        <w:t>)</w:t>
       </w:r>
     </w:p>
     <w:p>
@@ -724,8 +844,16 @@
         <w:rPr>
           <w:rStyle w:val="VerbatimChar"/>
         </w:rPr>
-        <w:t>ensemble_results_JCF-lam050.*</w:t>
-      </w:r>
+        <w:t>ensemble_results_JCF-lam</w:t>
+      </w:r>
+      <w:proofErr w:type="gramStart"/>
+      <w:r>
+        <w:rPr>
+          <w:rStyle w:val="VerbatimChar"/>
+        </w:rPr>
+        <w:t>050.*</w:t>
+      </w:r>
+      <w:proofErr w:type="gramEnd"/>
       <w:r>
         <w:t xml:space="preserve">, </w:t>
       </w:r>
@@ -733,8 +861,16 @@
         <w:rPr>
           <w:rStyle w:val="VerbatimChar"/>
         </w:rPr>
-        <w:t>JCF-lamlen</w:t>
-      </w:r>
+        <w:t>JCF-</w:t>
+      </w:r>
+      <w:proofErr w:type="spellStart"/>
+      <w:r>
+        <w:rPr>
+          <w:rStyle w:val="VerbatimChar"/>
+        </w:rPr>
+        <w:t>lamlen</w:t>
+      </w:r>
+      <w:proofErr w:type="spellEnd"/>
       <w:r>
         <w:t>, …), so nothing overwrites the baseline from step 3.</w:t>
       </w:r>
@@ -757,21 +893,47 @@
       <w:r>
         <w:t xml:space="preserve"> instead: </w:t>
       </w:r>
-      <w:r>
-        <w:rPr>
-          <w:rStyle w:val="VerbatimChar"/>
-        </w:rPr>
-        <w:t>create_ensemble_jcf()</w:t>
+      <w:proofErr w:type="spellStart"/>
+      <w:r>
+        <w:rPr>
+          <w:rStyle w:val="VerbatimChar"/>
+        </w:rPr>
+        <w:t>create_ensemble_</w:t>
+      </w:r>
+      <w:proofErr w:type="gramStart"/>
+      <w:r>
+        <w:rPr>
+          <w:rStyle w:val="VerbatimChar"/>
+        </w:rPr>
+        <w:t>jcf</w:t>
+      </w:r>
+      <w:proofErr w:type="spellEnd"/>
+      <w:r>
+        <w:rPr>
+          <w:rStyle w:val="VerbatimChar"/>
+        </w:rPr>
+        <w:t>(</w:t>
+      </w:r>
+      <w:proofErr w:type="gramEnd"/>
+      <w:r>
+        <w:rPr>
+          <w:rStyle w:val="VerbatimChar"/>
+        </w:rPr>
+        <w:t>)</w:t>
       </w:r>
       <w:r>
         <w:t xml:space="preserve"> (edit </w:t>
       </w:r>
+      <w:proofErr w:type="spellStart"/>
+      <w:proofErr w:type="gramStart"/>
       <w:r>
         <w:rPr>
           <w:rStyle w:val="VerbatimChar"/>
         </w:rPr>
         <w:t>config.lambda</w:t>
       </w:r>
+      <w:proofErr w:type="spellEnd"/>
+      <w:proofErr w:type="gramEnd"/>
       <w:r>
         <w:t>).</w:t>
       </w:r>
@@ -790,17 +952,33 @@
       <w:pPr>
         <w:pStyle w:val="SourceCode"/>
       </w:pPr>
+      <w:proofErr w:type="spellStart"/>
       <w:r>
         <w:rPr>
           <w:rStyle w:val="VariableTok"/>
         </w:rPr>
-        <w:t>compare_ensembles_jcf</w:t>
-      </w:r>
+        <w:t>compare_ensembles_</w:t>
+      </w:r>
+      <w:proofErr w:type="gramStart"/>
+      <w:r>
+        <w:rPr>
+          <w:rStyle w:val="VariableTok"/>
+        </w:rPr>
+        <w:t>jcf</w:t>
+      </w:r>
+      <w:proofErr w:type="spellEnd"/>
       <w:r>
         <w:rPr>
           <w:rStyle w:val="NormalTok"/>
         </w:rPr>
-        <w:t>()</w:t>
+        <w:t>(</w:t>
+      </w:r>
+      <w:proofErr w:type="gramEnd"/>
+      <w:r>
+        <w:rPr>
+          <w:rStyle w:val="NormalTok"/>
+        </w:rPr>
+        <w:t>)</w:t>
       </w:r>
     </w:p>
     <w:p>
@@ -910,17 +1088,33 @@
       <w:pPr>
         <w:pStyle w:val="SourceCode"/>
       </w:pPr>
+      <w:proofErr w:type="spellStart"/>
       <w:r>
         <w:rPr>
           <w:rStyle w:val="VariableTok"/>
         </w:rPr>
-        <w:t>plot_forecasts_jcf</w:t>
-      </w:r>
+        <w:t>plot_forecasts_</w:t>
+      </w:r>
+      <w:proofErr w:type="gramStart"/>
+      <w:r>
+        <w:rPr>
+          <w:rStyle w:val="VariableTok"/>
+        </w:rPr>
+        <w:t>jcf</w:t>
+      </w:r>
+      <w:proofErr w:type="spellEnd"/>
       <w:r>
         <w:rPr>
           <w:rStyle w:val="NormalTok"/>
         </w:rPr>
-        <w:t>()</w:t>
+        <w:t>(</w:t>
+      </w:r>
+      <w:proofErr w:type="gramEnd"/>
+      <w:r>
+        <w:rPr>
+          <w:rStyle w:val="NormalTok"/>
+        </w:rPr>
+        <w:t>)</w:t>
       </w:r>
     </w:p>
     <w:p>
@@ -930,11 +1124,19 @@
       <w:r>
         <w:t xml:space="preserve">Figures go to </w:t>
       </w:r>
-      <w:r>
-        <w:rPr>
-          <w:rStyle w:val="VerbatimChar"/>
-        </w:rPr>
-        <w:t>plots_jcf/</w:t>
+      <w:proofErr w:type="spellStart"/>
+      <w:r>
+        <w:rPr>
+          <w:rStyle w:val="VerbatimChar"/>
+        </w:rPr>
+        <w:t>plots_jcf</w:t>
+      </w:r>
+      <w:proofErr w:type="spellEnd"/>
+      <w:r>
+        <w:rPr>
+          <w:rStyle w:val="VerbatimChar"/>
+        </w:rPr>
+        <w:t>/</w:t>
       </w:r>
       <w:r>
         <w:t xml:space="preserve"> (separate from </w:t>
@@ -948,11 +1150,19 @@
       <w:r>
         <w:t xml:space="preserve">), with per-window figures in a </w:t>
       </w:r>
-      <w:r>
-        <w:rPr>
-          <w:rStyle w:val="VerbatimChar"/>
-        </w:rPr>
-        <w:t>plots_jcf/JCF-lam050/</w:t>
+      <w:proofErr w:type="spellStart"/>
+      <w:r>
+        <w:rPr>
+          <w:rStyle w:val="VerbatimChar"/>
+        </w:rPr>
+        <w:t>plots_jcf</w:t>
+      </w:r>
+      <w:proofErr w:type="spellEnd"/>
+      <w:r>
+        <w:rPr>
+          <w:rStyle w:val="VerbatimChar"/>
+        </w:rPr>
+        <w:t>/JCF-lam050/</w:t>
       </w:r>
       <w:r>
         <w:t xml:space="preserve"> subfolder.</w:t>
@@ -1036,21 +1246,25 @@
       <w:r>
         <w:t xml:space="preserve">, </w:t>
       </w:r>
+      <w:proofErr w:type="spellStart"/>
       <w:r>
         <w:rPr>
           <w:rStyle w:val="VerbatimChar"/>
         </w:rPr>
         <w:t>caddisease</w:t>
       </w:r>
+      <w:proofErr w:type="spellEnd"/>
       <w:r>
         <w:t xml:space="preserve">, </w:t>
       </w:r>
+      <w:proofErr w:type="spellStart"/>
       <w:r>
         <w:rPr>
           <w:rStyle w:val="VerbatimChar"/>
         </w:rPr>
         <w:t>model.fc</w:t>
       </w:r>
+      <w:proofErr w:type="spellEnd"/>
       <w:r>
         <w:t xml:space="preserve"> / </w:t>
       </w:r>
@@ -1063,12 +1277,16 @@
       <w:r>
         <w:t xml:space="preserve">, </w:t>
       </w:r>
+      <w:proofErr w:type="spellStart"/>
+      <w:proofErr w:type="gramStart"/>
       <w:r>
         <w:rPr>
           <w:rStyle w:val="VerbatimChar"/>
         </w:rPr>
         <w:t>params.label</w:t>
       </w:r>
+      <w:proofErr w:type="spellEnd"/>
+      <w:proofErr w:type="gramEnd"/>
       <w:r>
         <w:t xml:space="preserve">, </w:t>
       </w:r>
@@ -1081,30 +1299,40 @@
       <w:r>
         <w:t xml:space="preserve">, </w:t>
       </w:r>
+      <w:proofErr w:type="spellStart"/>
       <w:r>
         <w:rPr>
           <w:rStyle w:val="VerbatimChar"/>
         </w:rPr>
         <w:t>params.UB</w:t>
       </w:r>
+      <w:proofErr w:type="spellEnd"/>
       <w:r>
         <w:t xml:space="preserve">, </w:t>
       </w:r>
+      <w:proofErr w:type="spellStart"/>
+      <w:proofErr w:type="gramStart"/>
       <w:r>
         <w:rPr>
           <w:rStyle w:val="VerbatimChar"/>
         </w:rPr>
         <w:t>params.initial</w:t>
       </w:r>
+      <w:proofErr w:type="spellEnd"/>
+      <w:proofErr w:type="gramEnd"/>
       <w:r>
         <w:t xml:space="preserve">, </w:t>
       </w:r>
+      <w:proofErr w:type="spellStart"/>
+      <w:proofErr w:type="gramStart"/>
       <w:r>
         <w:rPr>
           <w:rStyle w:val="VerbatimChar"/>
         </w:rPr>
         <w:t>vars.initial</w:t>
       </w:r>
+      <w:proofErr w:type="spellEnd"/>
+      <w:proofErr w:type="gramEnd"/>
       <w:r>
         <w:t xml:space="preserve"> (first observation), </w:t>
       </w:r>
@@ -1117,12 +1345,16 @@
       <w:r>
         <w:t xml:space="preserve">, </w:t>
       </w:r>
+      <w:proofErr w:type="spellStart"/>
+      <w:proofErr w:type="gramStart"/>
       <w:r>
         <w:rPr>
           <w:rStyle w:val="VerbatimChar"/>
         </w:rPr>
         <w:t>forecastingperiod</w:t>
       </w:r>
+      <w:proofErr w:type="spellEnd"/>
+      <w:proofErr w:type="gramEnd"/>
       <w:r>
         <w:t>.</w:t>
       </w:r>
@@ -1236,48 +1468,58 @@
             <w:pPr>
               <w:pStyle w:val="Compact"/>
             </w:pPr>
+            <w:proofErr w:type="spellStart"/>
             <w:r>
               <w:rPr>
                 <w:rStyle w:val="VerbatimChar"/>
               </w:rPr>
               <w:t>dataset_file</w:t>
             </w:r>
+            <w:proofErr w:type="spellEnd"/>
             <w:r>
               <w:t xml:space="preserve">, </w:t>
             </w:r>
+            <w:proofErr w:type="spellStart"/>
             <w:r>
               <w:rPr>
                 <w:rStyle w:val="VerbatimChar"/>
               </w:rPr>
               <w:t>calib_period</w:t>
             </w:r>
+            <w:proofErr w:type="spellEnd"/>
             <w:r>
               <w:t xml:space="preserve">, </w:t>
             </w:r>
+            <w:proofErr w:type="spellStart"/>
             <w:r>
               <w:rPr>
                 <w:rStyle w:val="VerbatimChar"/>
               </w:rPr>
               <w:t>forecast_horizon</w:t>
             </w:r>
+            <w:proofErr w:type="spellEnd"/>
             <w:r>
               <w:t xml:space="preserve">, </w:t>
             </w:r>
+            <w:proofErr w:type="spellStart"/>
             <w:r>
               <w:rPr>
                 <w:rStyle w:val="VerbatimChar"/>
               </w:rPr>
               <w:t>n_windows</w:t>
             </w:r>
+            <w:proofErr w:type="spellEnd"/>
             <w:r>
               <w:t xml:space="preserve">, </w:t>
             </w:r>
+            <w:proofErr w:type="spellStart"/>
             <w:r>
               <w:rPr>
                 <w:rStyle w:val="VerbatimChar"/>
               </w:rPr>
               <w:t>window_shift</w:t>
             </w:r>
+            <w:proofErr w:type="spellEnd"/>
           </w:p>
         </w:tc>
         <w:tc>
@@ -1288,48 +1530,58 @@
             <w:pPr>
               <w:pStyle w:val="Compact"/>
             </w:pPr>
+            <w:proofErr w:type="spellStart"/>
             <w:r>
               <w:rPr>
                 <w:rStyle w:val="VerbatimChar"/>
               </w:rPr>
               <w:t>collect_metrics_simple</w:t>
             </w:r>
+            <w:proofErr w:type="spellEnd"/>
             <w:r>
               <w:t xml:space="preserve">, </w:t>
             </w:r>
+            <w:proofErr w:type="spellStart"/>
             <w:r>
               <w:rPr>
                 <w:rStyle w:val="VerbatimChar"/>
               </w:rPr>
               <w:t>create_ensemble_simple</w:t>
             </w:r>
+            <w:proofErr w:type="spellEnd"/>
             <w:r>
               <w:t xml:space="preserve">, </w:t>
             </w:r>
+            <w:proofErr w:type="spellStart"/>
             <w:r>
               <w:rPr>
                 <w:rStyle w:val="VerbatimChar"/>
               </w:rPr>
               <w:t>create_ensemble_jcf</w:t>
             </w:r>
+            <w:proofErr w:type="spellEnd"/>
             <w:r>
               <w:t xml:space="preserve">, </w:t>
             </w:r>
+            <w:proofErr w:type="spellStart"/>
             <w:r>
               <w:rPr>
                 <w:rStyle w:val="VerbatimChar"/>
               </w:rPr>
               <w:t>plot_forecasts_simple</w:t>
             </w:r>
+            <w:proofErr w:type="spellEnd"/>
             <w:r>
               <w:t xml:space="preserve">, </w:t>
             </w:r>
+            <w:proofErr w:type="spellStart"/>
             <w:r>
               <w:rPr>
                 <w:rStyle w:val="VerbatimChar"/>
               </w:rPr>
               <w:t>plot_forecasts_jcf</w:t>
             </w:r>
+            <w:proofErr w:type="spellEnd"/>
           </w:p>
         </w:tc>
       </w:tr>
@@ -1342,21 +1594,25 @@
             <w:pPr>
               <w:pStyle w:val="Compact"/>
             </w:pPr>
+            <w:proofErr w:type="spellStart"/>
             <w:r>
               <w:rPr>
                 <w:rStyle w:val="VerbatimChar"/>
               </w:rPr>
               <w:t>model_labels</w:t>
             </w:r>
+            <w:proofErr w:type="spellEnd"/>
             <w:r>
               <w:t xml:space="preserve"> (short names) and </w:t>
             </w:r>
+            <w:proofErr w:type="spellStart"/>
             <w:r>
               <w:rPr>
                 <w:rStyle w:val="VerbatimChar"/>
               </w:rPr>
               <w:t>model_names</w:t>
             </w:r>
+            <w:proofErr w:type="spellEnd"/>
             <w:r>
               <w:t xml:space="preserve"> (</w:t>
             </w:r>
@@ -1379,29 +1635,41 @@
             <w:pPr>
               <w:pStyle w:val="Compact"/>
             </w:pPr>
+            <w:proofErr w:type="spellStart"/>
             <w:r>
               <w:rPr>
                 <w:rStyle w:val="VerbatimChar"/>
               </w:rPr>
               <w:t>create_ensemble_simple</w:t>
             </w:r>
+            <w:proofErr w:type="spellEnd"/>
             <w:r>
               <w:t xml:space="preserve">, </w:t>
             </w:r>
+            <w:proofErr w:type="spellStart"/>
             <w:r>
               <w:rPr>
                 <w:rStyle w:val="VerbatimChar"/>
               </w:rPr>
               <w:t>create_ensemble_jcf</w:t>
             </w:r>
+            <w:proofErr w:type="spellEnd"/>
             <w:r>
               <w:t xml:space="preserve">, </w:t>
             </w:r>
-            <w:r>
-              <w:rPr>
-                <w:rStyle w:val="VerbatimChar"/>
-              </w:rPr>
-              <w:t>plot_forecasts_*</w:t>
+            <w:proofErr w:type="spellStart"/>
+            <w:r>
+              <w:rPr>
+                <w:rStyle w:val="VerbatimChar"/>
+              </w:rPr>
+              <w:t>plot_forecasts</w:t>
+            </w:r>
+            <w:proofErr w:type="spellEnd"/>
+            <w:r>
+              <w:rPr>
+                <w:rStyle w:val="VerbatimChar"/>
+              </w:rPr>
+              <w:t>_*</w:t>
             </w:r>
           </w:p>
         </w:tc>
@@ -1411,12 +1679,14 @@
       <w:pPr>
         <w:pStyle w:val="BodyText"/>
       </w:pPr>
+      <w:proofErr w:type="spellStart"/>
       <w:r>
         <w:rPr>
           <w:rStyle w:val="VerbatimChar"/>
         </w:rPr>
         <w:t>model_labels</w:t>
       </w:r>
+      <w:proofErr w:type="spellEnd"/>
       <w:r>
         <w:t xml:space="preserve"> must match the </w:t>
       </w:r>
@@ -1429,21 +1699,25 @@
       <w:r>
         <w:t xml:space="preserve"> column written by </w:t>
       </w:r>
+      <w:proofErr w:type="spellStart"/>
       <w:r>
         <w:rPr>
           <w:rStyle w:val="VerbatimChar"/>
         </w:rPr>
         <w:t>collect_metrics_simple</w:t>
       </w:r>
+      <w:proofErr w:type="spellEnd"/>
       <w:r>
         <w:t xml:space="preserve">; </w:t>
       </w:r>
+      <w:proofErr w:type="spellStart"/>
       <w:r>
         <w:rPr>
           <w:rStyle w:val="VerbatimChar"/>
         </w:rPr>
         <w:t>model_names</w:t>
       </w:r>
+      <w:proofErr w:type="spellEnd"/>
       <w:r>
         <w:t xml:space="preserve"> must match </w:t>
       </w:r>
@@ -1553,12 +1827,14 @@
       <w:r>
         <w:t xml:space="preserve">. </w:t>
       </w:r>
+      <w:proofErr w:type="spellStart"/>
       <w:r>
         <w:rPr>
           <w:rStyle w:val="VerbatimChar"/>
         </w:rPr>
         <w:t>create_ensemble_jcf</w:t>
       </w:r>
+      <w:proofErr w:type="spellEnd"/>
       <w:r>
         <w:t xml:space="preserve"> errors out otherwise.</w:t>
       </w:r>
@@ -1571,12 +1847,14 @@
           <w:numId w:val="2"/>
         </w:numPr>
       </w:pPr>
+      <w:proofErr w:type="spellStart"/>
       <w:r>
         <w:rPr>
           <w:rStyle w:val="VerbatimChar"/>
         </w:rPr>
         <w:t>n_windows</w:t>
       </w:r>
+      <w:proofErr w:type="spellEnd"/>
       <w:r>
         <w:t xml:space="preserve"> must not exceed what the series supports: </w:t>
       </w:r>
@@ -1821,11 +2099,33 @@
             <w:pPr>
               <w:pStyle w:val="Compact"/>
             </w:pPr>
-            <w:r>
-              <w:rPr>
-                <w:rStyle w:val="VerbatimChar"/>
-              </w:rPr>
-              <w:t>collect_metrics_simple()</w:t>
+            <w:proofErr w:type="spellStart"/>
+            <w:r>
+              <w:rPr>
+                <w:rStyle w:val="VerbatimChar"/>
+              </w:rPr>
+              <w:t>collect_metrics_</w:t>
+            </w:r>
+            <w:proofErr w:type="gramStart"/>
+            <w:r>
+              <w:rPr>
+                <w:rStyle w:val="VerbatimChar"/>
+              </w:rPr>
+              <w:t>simple</w:t>
+            </w:r>
+            <w:proofErr w:type="spellEnd"/>
+            <w:r>
+              <w:rPr>
+                <w:rStyle w:val="VerbatimChar"/>
+              </w:rPr>
+              <w:t>(</w:t>
+            </w:r>
+            <w:proofErr w:type="gramEnd"/>
+            <w:r>
+              <w:rPr>
+                <w:rStyle w:val="VerbatimChar"/>
+              </w:rPr>
+              <w:t>)</w:t>
             </w:r>
           </w:p>
         </w:tc>
@@ -1837,12 +2137,14 @@
             <w:pPr>
               <w:pStyle w:val="Compact"/>
             </w:pPr>
+            <w:proofErr w:type="spellStart"/>
             <w:r>
               <w:rPr>
                 <w:rStyle w:val="VerbatimChar"/>
               </w:rPr>
               <w:t>forecast_metrics_summary.mat</w:t>
             </w:r>
+            <w:proofErr w:type="spellEnd"/>
           </w:p>
         </w:tc>
       </w:tr>
@@ -1868,11 +2170,33 @@
             <w:pPr>
               <w:pStyle w:val="Compact"/>
             </w:pPr>
-            <w:r>
-              <w:rPr>
-                <w:rStyle w:val="VerbatimChar"/>
-              </w:rPr>
-              <w:t>create_ensemble_simple()</w:t>
+            <w:proofErr w:type="spellStart"/>
+            <w:r>
+              <w:rPr>
+                <w:rStyle w:val="VerbatimChar"/>
+              </w:rPr>
+              <w:t>create_ensemble_</w:t>
+            </w:r>
+            <w:proofErr w:type="gramStart"/>
+            <w:r>
+              <w:rPr>
+                <w:rStyle w:val="VerbatimChar"/>
+              </w:rPr>
+              <w:t>simple</w:t>
+            </w:r>
+            <w:proofErr w:type="spellEnd"/>
+            <w:r>
+              <w:rPr>
+                <w:rStyle w:val="VerbatimChar"/>
+              </w:rPr>
+              <w:t>(</w:t>
+            </w:r>
+            <w:proofErr w:type="gramEnd"/>
+            <w:r>
+              <w:rPr>
+                <w:rStyle w:val="VerbatimChar"/>
+              </w:rPr>
+              <w:t>)</w:t>
             </w:r>
           </w:p>
         </w:tc>
@@ -1915,20 +2239,64 @@
             <w:pPr>
               <w:pStyle w:val="Compact"/>
             </w:pPr>
-            <w:r>
-              <w:rPr>
-                <w:rStyle w:val="VerbatimChar"/>
-              </w:rPr>
-              <w:t>plot_model_fit_simple()</w:t>
+            <w:proofErr w:type="spellStart"/>
+            <w:r>
+              <w:rPr>
+                <w:rStyle w:val="VerbatimChar"/>
+              </w:rPr>
+              <w:t>plot_model_fit_</w:t>
+            </w:r>
+            <w:proofErr w:type="gramStart"/>
+            <w:r>
+              <w:rPr>
+                <w:rStyle w:val="VerbatimChar"/>
+              </w:rPr>
+              <w:t>simple</w:t>
+            </w:r>
+            <w:proofErr w:type="spellEnd"/>
+            <w:r>
+              <w:rPr>
+                <w:rStyle w:val="VerbatimChar"/>
+              </w:rPr>
+              <w:t>(</w:t>
+            </w:r>
+            <w:proofErr w:type="gramEnd"/>
+            <w:r>
+              <w:rPr>
+                <w:rStyle w:val="VerbatimChar"/>
+              </w:rPr>
+              <w:t>)</w:t>
             </w:r>
             <w:r>
               <w:t xml:space="preserve">, </w:t>
             </w:r>
-            <w:r>
-              <w:rPr>
-                <w:rStyle w:val="VerbatimChar"/>
-              </w:rPr>
-              <w:t>plot_forecasts_simple()</w:t>
+            <w:proofErr w:type="spellStart"/>
+            <w:r>
+              <w:rPr>
+                <w:rStyle w:val="VerbatimChar"/>
+              </w:rPr>
+              <w:t>plot_forecasts_</w:t>
+            </w:r>
+            <w:proofErr w:type="gramStart"/>
+            <w:r>
+              <w:rPr>
+                <w:rStyle w:val="VerbatimChar"/>
+              </w:rPr>
+              <w:t>simple</w:t>
+            </w:r>
+            <w:proofErr w:type="spellEnd"/>
+            <w:r>
+              <w:rPr>
+                <w:rStyle w:val="VerbatimChar"/>
+              </w:rPr>
+              <w:t>(</w:t>
+            </w:r>
+            <w:proofErr w:type="gramEnd"/>
+            <w:r>
+              <w:rPr>
+                <w:rStyle w:val="VerbatimChar"/>
+              </w:rPr>
+              <w:t>)</w:t>
             </w:r>
           </w:p>
         </w:tc>
@@ -1971,11 +2339,33 @@
             <w:pPr>
               <w:pStyle w:val="Compact"/>
             </w:pPr>
-            <w:r>
-              <w:rPr>
-                <w:rStyle w:val="VerbatimChar"/>
-              </w:rPr>
-              <w:t>run_jcf_sweep()</w:t>
+            <w:proofErr w:type="spellStart"/>
+            <w:r>
+              <w:rPr>
+                <w:rStyle w:val="VerbatimChar"/>
+              </w:rPr>
+              <w:t>run_jcf_</w:t>
+            </w:r>
+            <w:proofErr w:type="gramStart"/>
+            <w:r>
+              <w:rPr>
+                <w:rStyle w:val="VerbatimChar"/>
+              </w:rPr>
+              <w:t>sweep</w:t>
+            </w:r>
+            <w:proofErr w:type="spellEnd"/>
+            <w:r>
+              <w:rPr>
+                <w:rStyle w:val="VerbatimChar"/>
+              </w:rPr>
+              <w:t>(</w:t>
+            </w:r>
+            <w:proofErr w:type="gramEnd"/>
+            <w:r>
+              <w:rPr>
+                <w:rStyle w:val="VerbatimChar"/>
+              </w:rPr>
+              <w:t>)</w:t>
             </w:r>
           </w:p>
         </w:tc>
@@ -2018,11 +2408,33 @@
             <w:pPr>
               <w:pStyle w:val="Compact"/>
             </w:pPr>
-            <w:r>
-              <w:rPr>
-                <w:rStyle w:val="VerbatimChar"/>
-              </w:rPr>
-              <w:t>compare_ensembles_jcf()</w:t>
+            <w:proofErr w:type="spellStart"/>
+            <w:r>
+              <w:rPr>
+                <w:rStyle w:val="VerbatimChar"/>
+              </w:rPr>
+              <w:t>compare_ensembles_</w:t>
+            </w:r>
+            <w:proofErr w:type="gramStart"/>
+            <w:r>
+              <w:rPr>
+                <w:rStyle w:val="VerbatimChar"/>
+              </w:rPr>
+              <w:t>jcf</w:t>
+            </w:r>
+            <w:proofErr w:type="spellEnd"/>
+            <w:r>
+              <w:rPr>
+                <w:rStyle w:val="VerbatimChar"/>
+              </w:rPr>
+              <w:t>(</w:t>
+            </w:r>
+            <w:proofErr w:type="gramEnd"/>
+            <w:r>
+              <w:rPr>
+                <w:rStyle w:val="VerbatimChar"/>
+              </w:rPr>
+              <w:t>)</w:t>
             </w:r>
           </w:p>
         </w:tc>
@@ -2065,11 +2477,33 @@
             <w:pPr>
               <w:pStyle w:val="Compact"/>
             </w:pPr>
-            <w:r>
-              <w:rPr>
-                <w:rStyle w:val="VerbatimChar"/>
-              </w:rPr>
-              <w:t>plot_forecasts_jcf()</w:t>
+            <w:proofErr w:type="spellStart"/>
+            <w:r>
+              <w:rPr>
+                <w:rStyle w:val="VerbatimChar"/>
+              </w:rPr>
+              <w:t>plot_forecasts_</w:t>
+            </w:r>
+            <w:proofErr w:type="gramStart"/>
+            <w:r>
+              <w:rPr>
+                <w:rStyle w:val="VerbatimChar"/>
+              </w:rPr>
+              <w:t>jcf</w:t>
+            </w:r>
+            <w:proofErr w:type="spellEnd"/>
+            <w:r>
+              <w:rPr>
+                <w:rStyle w:val="VerbatimChar"/>
+              </w:rPr>
+              <w:t>(</w:t>
+            </w:r>
+            <w:proofErr w:type="gramEnd"/>
+            <w:r>
+              <w:rPr>
+                <w:rStyle w:val="VerbatimChar"/>
+              </w:rPr>
+              <w:t>)</w:t>
             </w:r>
           </w:p>
         </w:tc>
@@ -2081,11 +2515,19 @@
             <w:pPr>
               <w:pStyle w:val="Compact"/>
             </w:pPr>
-            <w:r>
-              <w:rPr>
-                <w:rStyle w:val="VerbatimChar"/>
-              </w:rPr>
-              <w:t>plots_jcf/</w:t>
+            <w:proofErr w:type="spellStart"/>
+            <w:r>
+              <w:rPr>
+                <w:rStyle w:val="VerbatimChar"/>
+              </w:rPr>
+              <w:t>plots_jcf</w:t>
+            </w:r>
+            <w:proofErr w:type="spellEnd"/>
+            <w:r>
+              <w:rPr>
+                <w:rStyle w:val="VerbatimChar"/>
+              </w:rPr>
+              <w:t>/</w:t>
             </w:r>
           </w:p>
         </w:tc>
@@ -2137,6 +2579,567 @@
         <w:t>stacked weight-trajectory figure is the most informative plot: flat bars mean JCF is doing little, shifting bars mean it is adapting as the epidemic turns.</w:t>
       </w:r>
       <w:bookmarkEnd w:id="15"/>
+    </w:p>
+    <w:p>
+      <w:pPr>
+        <w:pStyle w:val="BodyText"/>
+      </w:pPr>
+    </w:p>
+    <w:p>
+      <w:r>
+        <w:t>Optional (making editable plots)</w:t>
+      </w:r>
+    </w:p>
+    <w:p>
+      <w:pPr>
+        <w:contextualSpacing/>
+        <w:rPr>
+          <w:color w:val="EE0000"/>
+        </w:rPr>
+      </w:pPr>
+      <w:r>
+        <w:rPr>
+          <w:color w:val="EE0000"/>
+        </w:rPr>
+        <w:t xml:space="preserve">%Using built in plot editor of </w:t>
+      </w:r>
+      <w:proofErr w:type="spellStart"/>
+      <w:r>
+        <w:rPr>
+          <w:color w:val="EE0000"/>
+        </w:rPr>
+        <w:t>matlab</w:t>
+      </w:r>
+      <w:proofErr w:type="spellEnd"/>
+      <w:r>
+        <w:rPr>
+          <w:color w:val="EE0000"/>
+        </w:rPr>
+        <w:t xml:space="preserve"> to edit the .fig files</w:t>
+      </w:r>
+    </w:p>
+    <w:p>
+      <w:pPr>
+        <w:contextualSpacing/>
+        <w:rPr>
+          <w:color w:val="EE0000"/>
+        </w:rPr>
+      </w:pPr>
+      <w:proofErr w:type="spellStart"/>
+      <w:r>
+        <w:rPr>
+          <w:color w:val="EE0000"/>
+        </w:rPr>
+        <w:t>fig_files</w:t>
+      </w:r>
+      <w:proofErr w:type="spellEnd"/>
+      <w:r>
+        <w:rPr>
+          <w:color w:val="EE0000"/>
+        </w:rPr>
+        <w:t xml:space="preserve"> = </w:t>
+      </w:r>
+      <w:proofErr w:type="spellStart"/>
+      <w:r>
+        <w:rPr>
+          <w:color w:val="EE0000"/>
+        </w:rPr>
+        <w:t>dir</w:t>
+      </w:r>
+      <w:proofErr w:type="spellEnd"/>
+      <w:r>
+        <w:rPr>
+          <w:color w:val="EE0000"/>
+        </w:rPr>
+        <w:t>('</w:t>
+      </w:r>
+      <w:proofErr w:type="spellStart"/>
+      <w:r>
+        <w:rPr>
+          <w:color w:val="EE0000"/>
+        </w:rPr>
+        <w:t>foldername</w:t>
+      </w:r>
+      <w:proofErr w:type="spellEnd"/>
+      <w:r>
+        <w:rPr>
+          <w:color w:val="EE0000"/>
+        </w:rPr>
+        <w:t>/</w:t>
+      </w:r>
+      <w:r>
+        <w:rPr>
+          <w:color w:val="EE0000"/>
+        </w:rPr>
+        <w:t>*.fig');</w:t>
+      </w:r>
+    </w:p>
+    <w:p>
+      <w:pPr>
+        <w:contextualSpacing/>
+        <w:rPr>
+          <w:color w:val="EE0000"/>
+        </w:rPr>
+      </w:pPr>
+    </w:p>
+    <w:p>
+      <w:pPr>
+        <w:contextualSpacing/>
+        <w:rPr>
+          <w:color w:val="EE0000"/>
+        </w:rPr>
+      </w:pPr>
+      <w:r>
+        <w:rPr>
+          <w:color w:val="EE0000"/>
+        </w:rPr>
+        <w:t xml:space="preserve">for </w:t>
+      </w:r>
+      <w:proofErr w:type="spellStart"/>
+      <w:r>
+        <w:rPr>
+          <w:color w:val="EE0000"/>
+        </w:rPr>
+        <w:t>i</w:t>
+      </w:r>
+      <w:proofErr w:type="spellEnd"/>
+      <w:r>
+        <w:rPr>
+          <w:color w:val="EE0000"/>
+        </w:rPr>
+        <w:t xml:space="preserve"> = </w:t>
+      </w:r>
+      <w:proofErr w:type="gramStart"/>
+      <w:r>
+        <w:rPr>
+          <w:color w:val="EE0000"/>
+        </w:rPr>
+        <w:t>1:length</w:t>
+      </w:r>
+      <w:proofErr w:type="gramEnd"/>
+      <w:r>
+        <w:rPr>
+          <w:color w:val="EE0000"/>
+        </w:rPr>
+        <w:t>(</w:t>
+      </w:r>
+      <w:proofErr w:type="spellStart"/>
+      <w:r>
+        <w:rPr>
+          <w:color w:val="EE0000"/>
+        </w:rPr>
+        <w:t>fig_files</w:t>
+      </w:r>
+      <w:proofErr w:type="spellEnd"/>
+      <w:r>
+        <w:rPr>
+          <w:color w:val="EE0000"/>
+        </w:rPr>
+        <w:t>)</w:t>
+      </w:r>
+    </w:p>
+    <w:p>
+      <w:pPr>
+        <w:contextualSpacing/>
+        <w:rPr>
+          <w:color w:val="EE0000"/>
+        </w:rPr>
+      </w:pPr>
+      <w:r>
+        <w:rPr>
+          <w:color w:val="EE0000"/>
+        </w:rPr>
+        <w:t xml:space="preserve">    </w:t>
+      </w:r>
+      <w:proofErr w:type="spellStart"/>
+      <w:r>
+        <w:rPr>
+          <w:color w:val="EE0000"/>
+        </w:rPr>
+        <w:t>filepath</w:t>
+      </w:r>
+      <w:proofErr w:type="spellEnd"/>
+      <w:r>
+        <w:rPr>
+          <w:color w:val="EE0000"/>
+        </w:rPr>
+        <w:t xml:space="preserve"> = </w:t>
+      </w:r>
+      <w:proofErr w:type="spellStart"/>
+      <w:r>
+        <w:rPr>
+          <w:color w:val="EE0000"/>
+        </w:rPr>
+        <w:t>fullfile</w:t>
+      </w:r>
+      <w:proofErr w:type="spellEnd"/>
+      <w:r>
+        <w:rPr>
+          <w:color w:val="EE0000"/>
+        </w:rPr>
+        <w:t>(</w:t>
+      </w:r>
+      <w:proofErr w:type="spellStart"/>
+      <w:r>
+        <w:rPr>
+          <w:color w:val="EE0000"/>
+        </w:rPr>
+        <w:t>fig_files</w:t>
+      </w:r>
+      <w:proofErr w:type="spellEnd"/>
+      <w:r>
+        <w:rPr>
+          <w:color w:val="EE0000"/>
+        </w:rPr>
+        <w:t>(</w:t>
+      </w:r>
+      <w:proofErr w:type="spellStart"/>
+      <w:r>
+        <w:rPr>
+          <w:color w:val="EE0000"/>
+        </w:rPr>
+        <w:t>i</w:t>
+      </w:r>
+      <w:proofErr w:type="spellEnd"/>
+      <w:proofErr w:type="gramStart"/>
+      <w:r>
+        <w:rPr>
+          <w:color w:val="EE0000"/>
+        </w:rPr>
+        <w:t>).folder</w:t>
+      </w:r>
+      <w:proofErr w:type="gramEnd"/>
+      <w:r>
+        <w:rPr>
+          <w:color w:val="EE0000"/>
+        </w:rPr>
+        <w:t xml:space="preserve">, </w:t>
+      </w:r>
+      <w:proofErr w:type="spellStart"/>
+      <w:r>
+        <w:rPr>
+          <w:color w:val="EE0000"/>
+        </w:rPr>
+        <w:t>fig_files</w:t>
+      </w:r>
+      <w:proofErr w:type="spellEnd"/>
+      <w:r>
+        <w:rPr>
+          <w:color w:val="EE0000"/>
+        </w:rPr>
+        <w:t>(</w:t>
+      </w:r>
+      <w:proofErr w:type="spellStart"/>
+      <w:r>
+        <w:rPr>
+          <w:color w:val="EE0000"/>
+        </w:rPr>
+        <w:t>i</w:t>
+      </w:r>
+      <w:proofErr w:type="spellEnd"/>
+      <w:r>
+        <w:rPr>
+          <w:color w:val="EE0000"/>
+        </w:rPr>
+        <w:t>).name);</w:t>
+      </w:r>
+    </w:p>
+    <w:p>
+      <w:pPr>
+        <w:contextualSpacing/>
+        <w:rPr>
+          <w:color w:val="EE0000"/>
+        </w:rPr>
+      </w:pPr>
+      <w:r>
+        <w:rPr>
+          <w:color w:val="EE0000"/>
+        </w:rPr>
+        <w:t xml:space="preserve">    </w:t>
+      </w:r>
+    </w:p>
+    <w:p>
+      <w:pPr>
+        <w:contextualSpacing/>
+        <w:rPr>
+          <w:color w:val="EE0000"/>
+        </w:rPr>
+      </w:pPr>
+      <w:r>
+        <w:rPr>
+          <w:color w:val="EE0000"/>
+        </w:rPr>
+        <w:t xml:space="preserve">    fig = </w:t>
+      </w:r>
+      <w:proofErr w:type="spellStart"/>
+      <w:proofErr w:type="gramStart"/>
+      <w:r>
+        <w:rPr>
+          <w:color w:val="EE0000"/>
+        </w:rPr>
+        <w:t>openfig</w:t>
+      </w:r>
+      <w:proofErr w:type="spellEnd"/>
+      <w:r>
+        <w:rPr>
+          <w:color w:val="EE0000"/>
+        </w:rPr>
+        <w:t>(</w:t>
+      </w:r>
+      <w:proofErr w:type="spellStart"/>
+      <w:proofErr w:type="gramEnd"/>
+      <w:r>
+        <w:rPr>
+          <w:color w:val="EE0000"/>
+        </w:rPr>
+        <w:t>filepath</w:t>
+      </w:r>
+      <w:proofErr w:type="spellEnd"/>
+      <w:r>
+        <w:rPr>
+          <w:color w:val="EE0000"/>
+        </w:rPr>
+        <w:t>, 'invisible');</w:t>
+      </w:r>
+    </w:p>
+    <w:p>
+      <w:pPr>
+        <w:contextualSpacing/>
+        <w:rPr>
+          <w:color w:val="EE0000"/>
+        </w:rPr>
+      </w:pPr>
+      <w:r>
+        <w:rPr>
+          <w:color w:val="EE0000"/>
+        </w:rPr>
+        <w:t xml:space="preserve">    </w:t>
+      </w:r>
+      <w:proofErr w:type="gramStart"/>
+      <w:r>
+        <w:rPr>
+          <w:color w:val="EE0000"/>
+        </w:rPr>
+        <w:t>set(</w:t>
+      </w:r>
+      <w:proofErr w:type="gramEnd"/>
+      <w:r>
+        <w:rPr>
+          <w:color w:val="EE0000"/>
+        </w:rPr>
+        <w:t>fig, 'Visible', 'on');</w:t>
+      </w:r>
+    </w:p>
+    <w:p>
+      <w:pPr>
+        <w:contextualSpacing/>
+        <w:rPr>
+          <w:color w:val="EE0000"/>
+        </w:rPr>
+      </w:pPr>
+      <w:r>
+        <w:rPr>
+          <w:color w:val="EE0000"/>
+        </w:rPr>
+        <w:t xml:space="preserve">    </w:t>
+      </w:r>
+      <w:proofErr w:type="spellStart"/>
+      <w:r>
+        <w:rPr>
+          <w:color w:val="EE0000"/>
+        </w:rPr>
+        <w:t>drawnow</w:t>
+      </w:r>
+      <w:proofErr w:type="spellEnd"/>
+      <w:r>
+        <w:rPr>
+          <w:color w:val="EE0000"/>
+        </w:rPr>
+        <w:t>;</w:t>
+      </w:r>
+    </w:p>
+    <w:p>
+      <w:pPr>
+        <w:contextualSpacing/>
+        <w:rPr>
+          <w:color w:val="EE0000"/>
+        </w:rPr>
+      </w:pPr>
+      <w:r>
+        <w:rPr>
+          <w:color w:val="EE0000"/>
+        </w:rPr>
+        <w:t xml:space="preserve">    </w:t>
+      </w:r>
+    </w:p>
+    <w:p>
+      <w:pPr>
+        <w:contextualSpacing/>
+        <w:rPr>
+          <w:color w:val="EE0000"/>
+        </w:rPr>
+      </w:pPr>
+      <w:r>
+        <w:rPr>
+          <w:color w:val="EE0000"/>
+        </w:rPr>
+        <w:t xml:space="preserve">    </w:t>
+      </w:r>
+      <w:proofErr w:type="spellStart"/>
+      <w:proofErr w:type="gramStart"/>
+      <w:r>
+        <w:rPr>
+          <w:color w:val="EE0000"/>
+        </w:rPr>
+        <w:t>saveas</w:t>
+      </w:r>
+      <w:proofErr w:type="spellEnd"/>
+      <w:r>
+        <w:rPr>
+          <w:color w:val="EE0000"/>
+        </w:rPr>
+        <w:t>(</w:t>
+      </w:r>
+      <w:proofErr w:type="gramEnd"/>
+      <w:r>
+        <w:rPr>
+          <w:color w:val="EE0000"/>
+        </w:rPr>
+        <w:t xml:space="preserve">fig, </w:t>
+      </w:r>
+      <w:proofErr w:type="spellStart"/>
+      <w:r>
+        <w:rPr>
+          <w:color w:val="EE0000"/>
+        </w:rPr>
+        <w:t>filepath</w:t>
+      </w:r>
+      <w:proofErr w:type="spellEnd"/>
+      <w:proofErr w:type="gramStart"/>
+      <w:r>
+        <w:rPr>
+          <w:color w:val="EE0000"/>
+        </w:rPr>
+        <w:t>);  %</w:t>
+      </w:r>
+      <w:proofErr w:type="gramEnd"/>
+      <w:r>
+        <w:rPr>
+          <w:color w:val="EE0000"/>
+        </w:rPr>
+        <w:t xml:space="preserve"> Overwrite with corrected visibility</w:t>
+      </w:r>
+    </w:p>
+    <w:p>
+      <w:pPr>
+        <w:contextualSpacing/>
+        <w:rPr>
+          <w:color w:val="EE0000"/>
+        </w:rPr>
+      </w:pPr>
+      <w:r>
+        <w:rPr>
+          <w:color w:val="EE0000"/>
+        </w:rPr>
+        <w:t xml:space="preserve">    close(fig);</w:t>
+      </w:r>
+    </w:p>
+    <w:p>
+      <w:pPr>
+        <w:contextualSpacing/>
+        <w:rPr>
+          <w:color w:val="EE0000"/>
+        </w:rPr>
+      </w:pPr>
+      <w:r>
+        <w:rPr>
+          <w:color w:val="EE0000"/>
+        </w:rPr>
+        <w:t xml:space="preserve">    </w:t>
+      </w:r>
+    </w:p>
+    <w:p>
+      <w:pPr>
+        <w:contextualSpacing/>
+        <w:rPr>
+          <w:color w:val="EE0000"/>
+        </w:rPr>
+      </w:pPr>
+      <w:r>
+        <w:rPr>
+          <w:color w:val="EE0000"/>
+        </w:rPr>
+        <w:t xml:space="preserve">    </w:t>
+      </w:r>
+      <w:proofErr w:type="spellStart"/>
+      <w:proofErr w:type="gramStart"/>
+      <w:r>
+        <w:rPr>
+          <w:color w:val="EE0000"/>
+        </w:rPr>
+        <w:t>fprintf</w:t>
+      </w:r>
+      <w:proofErr w:type="spellEnd"/>
+      <w:r>
+        <w:rPr>
+          <w:color w:val="EE0000"/>
+        </w:rPr>
+        <w:t>(</w:t>
+      </w:r>
+      <w:proofErr w:type="gramEnd"/>
+      <w:r>
+        <w:rPr>
+          <w:color w:val="EE0000"/>
+        </w:rPr>
+        <w:t xml:space="preserve">'Fixed: %s\n', </w:t>
+      </w:r>
+      <w:proofErr w:type="spellStart"/>
+      <w:r>
+        <w:rPr>
+          <w:color w:val="EE0000"/>
+        </w:rPr>
+        <w:t>fig_files</w:t>
+      </w:r>
+      <w:proofErr w:type="spellEnd"/>
+      <w:r>
+        <w:rPr>
+          <w:color w:val="EE0000"/>
+        </w:rPr>
+        <w:t>(</w:t>
+      </w:r>
+      <w:proofErr w:type="spellStart"/>
+      <w:r>
+        <w:rPr>
+          <w:color w:val="EE0000"/>
+        </w:rPr>
+        <w:t>i</w:t>
+      </w:r>
+      <w:proofErr w:type="spellEnd"/>
+      <w:r>
+        <w:rPr>
+          <w:color w:val="EE0000"/>
+        </w:rPr>
+        <w:t>).name);</w:t>
+      </w:r>
+    </w:p>
+    <w:p>
+      <w:pPr>
+        <w:contextualSpacing/>
+        <w:rPr>
+          <w:color w:val="EE0000"/>
+        </w:rPr>
+      </w:pPr>
+      <w:r>
+        <w:rPr>
+          <w:color w:val="EE0000"/>
+        </w:rPr>
+        <w:t>end</w:t>
+      </w:r>
+    </w:p>
+    <w:p>
+      <w:pPr>
+        <w:pStyle w:val="BodyText"/>
+      </w:pPr>
     </w:p>
     <w:sectPr>
       <w:footnotePr>

</xml_diff>